<commit_message>
feat: thêm toggle khóa/mở khóa cột, đổi Ghi chú thành Tiêu đề mail trong Sơ bộ
</commit_message>
<xml_diff>
--- a/samples/templates/individual/mau_bbnt.docx
+++ b/samples/templates/individual/mau_bbnt.docx
@@ -148,16 +148,6 @@
         </w:rPr>
         <w:t>Căn cứ đề nghị thẩm định giá của {{TEN_KHACH_HANG}}</w:t>
       </w:r>
-      <w:r>
-        <w:rPr>
-          <w:rFonts w:ascii="Times New Roman" w:hAnsi="Times New Roman"/>
-          <w:noProof/>
-          <w:spacing w:val="3"/>
-          <w:sz w:val="24"/>
-          <w:szCs w:val="24"/>
-          <w:shd w:val="clear" w:color="auto" w:fill="FFFFFF"/>
-        </w:rPr>
-      </w:r>
     </w:p>
     <w:p>
       <w:pPr>
@@ -185,77 +175,20 @@
         </w:rPr>
         <w:t>Hôm nay, ngày  {{NGAY}}  tháng {{THANG}}  năm {{NAM}}, chúng tôi gồm:</w:t>
       </w:r>
-      <w:r>
+    </w:p>
+    <w:p>
+      <w:pPr>
+        <w:shd w:val="clear" w:color="auto" w:fill="FFFFFF" w:themeFill="background1"/>
+        <w:spacing w:line="276" w:lineRule="auto"/>
+        <w:jc w:val="both"/>
         <w:rPr>
           <w:rFonts w:ascii="Times New Roman" w:hAnsi="Times New Roman"/>
           <w:bCs/>
           <w:spacing w:val="2"/>
           <w:sz w:val="24"/>
           <w:szCs w:val="24"/>
-        </w:rPr>
-      </w:r>
-      <w:r>
-        <w:rPr>
-          <w:rFonts w:ascii="Times New Roman" w:hAnsi="Times New Roman"/>
-          <w:bCs/>
-          <w:spacing w:val="2"/>
-          <w:sz w:val="24"/>
-          <w:szCs w:val="24"/>
           <w:lang w:val="vi-VN"/>
         </w:rPr>
-      </w:r>
-      <w:r>
-        <w:rPr>
-          <w:rFonts w:ascii="Times New Roman" w:hAnsi="Times New Roman"/>
-          <w:bCs/>
-          <w:spacing w:val="2"/>
-          <w:sz w:val="24"/>
-          <w:szCs w:val="24"/>
-        </w:rPr>
-      </w:r>
-      <w:r>
-        <w:rPr>
-          <w:rFonts w:ascii="Times New Roman" w:hAnsi="Times New Roman"/>
-          <w:bCs/>
-          <w:spacing w:val="2"/>
-          <w:sz w:val="24"/>
-          <w:szCs w:val="24"/>
-          <w:lang w:val="vi-VN"/>
-        </w:rPr>
-      </w:r>
-      <w:r>
-        <w:rPr>
-          <w:rFonts w:ascii="Times New Roman" w:hAnsi="Times New Roman"/>
-          <w:bCs/>
-          <w:spacing w:val="2"/>
-          <w:sz w:val="24"/>
-          <w:szCs w:val="24"/>
-        </w:rPr>
-      </w:r>
-      <w:r>
-        <w:rPr>
-          <w:rFonts w:ascii="Times New Roman" w:hAnsi="Times New Roman"/>
-          <w:bCs/>
-          <w:spacing w:val="2"/>
-          <w:sz w:val="24"/>
-          <w:szCs w:val="24"/>
-          <w:lang w:val="vi-VN"/>
-        </w:rPr>
-      </w:r>
-    </w:p>
-    <w:p>
-      <w:pPr>
-        <w:shd w:val="clear" w:color="auto" w:fill="FFFFFF" w:themeFill="background1"/>
-        <w:spacing w:line="276" w:lineRule="auto"/>
-        <w:jc w:val="both"/>
-        <w:rPr>
-          <w:rFonts w:ascii="Times New Roman" w:hAnsi="Times New Roman"/>
-          <w:bCs/>
-          <w:spacing w:val="2"/>
-          <w:sz w:val="24"/>
-          <w:szCs w:val="24"/>
-          <w:lang w:val="vi-VN"/>
-        </w:rPr>
       </w:pPr>
       <w:r>
         <w:rPr>
@@ -266,17 +199,6 @@
           <w:lang w:val="de-DE"/>
         </w:rPr>
         <w:t xml:space="preserve">            BÊN NHẬN BÀN GIAO (BÊN A): {{TEN_KHACH_HANG}}</w:t>
-      </w:r>
-      <w:r>
-        <w:rPr>
-          <w:rFonts w:ascii="Times New Roman" w:hAnsi="Times New Roman"/>
-          <w:b/>
-          <w:noProof/>
-          <w:spacing w:val="-6"/>
-          <w:sz w:val="24"/>
-          <w:szCs w:val="24"/>
-          <w:lang w:val="de-DE"/>
-        </w:rPr>
       </w:r>
     </w:p>
     <w:p>
@@ -301,32 +223,6 @@
         </w:rPr>
         <w:t xml:space="preserve">           - Địa chỉ: {{DIA_CHI_KHACH_HANG}}</w:t>
       </w:r>
-      <w:r>
-        <w:rPr>
-          <w:rFonts w:ascii="Times New Roman" w:hAnsi="Times New Roman"/>
-          <w:sz w:val="24"/>
-          <w:szCs w:val="24"/>
-          <w:lang w:val="nl-NL"/>
-        </w:rPr>
-      </w:r>
-      <w:r>
-        <w:rPr>
-          <w:rFonts w:ascii="Times New Roman" w:hAnsi="Times New Roman"/>
-          <w:sz w:val="24"/>
-          <w:szCs w:val="24"/>
-          <w:lang w:val="nl-NL"/>
-        </w:rPr>
-      </w:r>
-      <w:r/>
-      <w:r>
-        <w:rPr>
-          <w:rFonts w:ascii="Times New Roman" w:hAnsi="Times New Roman"/>
-          <w:noProof/>
-          <w:sz w:val="24"/>
-          <w:szCs w:val="24"/>
-          <w:lang w:val="nl-NL"/>
-        </w:rPr>
-      </w:r>
     </w:p>
     <w:p>
       <w:pPr>
@@ -350,25 +246,6 @@
           <w:lang w:val="nl-NL"/>
         </w:rPr>
         <w:t xml:space="preserve">           - CCCD: {{CCCD}}</w:t>
-      </w:r>
-      <w:r>
-        <w:rPr>
-          <w:rFonts w:ascii="Times New Roman" w:hAnsi="Times New Roman"/>
-          <w:spacing w:val="3"/>
-          <w:sz w:val="24"/>
-          <w:szCs w:val="24"/>
-          <w:shd w:val="clear" w:color="auto" w:fill="FFFFFF"/>
-        </w:rPr>
-      </w:r>
-      <w:r>
-        <w:rPr>
-          <w:rFonts w:ascii="Times New Roman" w:hAnsi="Times New Roman"/>
-          <w:noProof/>
-          <w:spacing w:val="3"/>
-          <w:sz w:val="24"/>
-          <w:szCs w:val="24"/>
-          <w:shd w:val="clear" w:color="auto" w:fill="FFFFFF"/>
-        </w:rPr>
       </w:r>
     </w:p>
     <w:p>
@@ -408,7 +285,7 @@
     </w:p>
     <w:p>
       <w:pPr>
-        <w:pStyle w:val="oancuaDanhsach"/>
+        <w:pStyle w:val="ListParagraph"/>
         <w:numPr>
           <w:ilvl w:val="0"/>
           <w:numId w:val="2"/>
@@ -440,7 +317,7 @@
     </w:p>
     <w:p>
       <w:pPr>
-        <w:pStyle w:val="oancuaDanhsach"/>
+        <w:pStyle w:val="ListParagraph"/>
         <w:numPr>
           <w:ilvl w:val="0"/>
           <w:numId w:val="2"/>
@@ -475,7 +352,7 @@
     </w:p>
     <w:p>
       <w:pPr>
-        <w:pStyle w:val="oancuaDanhsach"/>
+        <w:pStyle w:val="ListParagraph"/>
         <w:numPr>
           <w:ilvl w:val="0"/>
           <w:numId w:val="2"/>
@@ -503,7 +380,7 @@
     </w:p>
     <w:p>
       <w:pPr>
-        <w:pStyle w:val="oancuaDanhsach"/>
+        <w:pStyle w:val="ListParagraph"/>
         <w:numPr>
           <w:ilvl w:val="0"/>
           <w:numId w:val="2"/>
@@ -535,7 +412,7 @@
     </w:p>
     <w:p>
       <w:pPr>
-        <w:pStyle w:val="oancuaDanhsach"/>
+        <w:pStyle w:val="ListParagraph"/>
         <w:numPr>
           <w:ilvl w:val="0"/>
           <w:numId w:val="2"/>
@@ -600,7 +477,7 @@
     </w:p>
     <w:p>
       <w:pPr>
-        <w:pStyle w:val="oancuaDanhsach"/>
+        <w:pStyle w:val="ListParagraph"/>
         <w:shd w:val="clear" w:color="auto" w:fill="FFFFFF" w:themeFill="background1"/>
         <w:spacing w:before="60" w:after="60" w:line="276" w:lineRule="auto"/>
         <w:ind w:left="786"/>
@@ -681,73 +558,6 @@
         </w:rPr>
         <w:t>1. Chứng thư Thẩm định giá theo hợp đồng {{SO_HOP_DONG_VAN_BAN}} do Công Ty Cổ Phần Thẩm Định Giá Thế Kỷ - Chi nhánh tại TP HCM đáp ứng các yêu cầu theo quy định pháp luật.</w:t>
       </w:r>
-      <w:r>
-        <w:rPr>
-          <w:rFonts w:ascii="Times New Roman" w:hAnsi="Times New Roman"/>
-          <w:bCs/>
-          <w:sz w:val="24"/>
-          <w:szCs w:val="24"/>
-          <w:lang w:val="nl-NL"/>
-        </w:rPr>
-      </w:r>
-      <w:r>
-        <w:rPr>
-          <w:rFonts w:ascii="Times New Roman" w:hAnsi="Times New Roman"/>
-          <w:noProof/>
-          <w:sz w:val="24"/>
-          <w:szCs w:val="24"/>
-        </w:rPr>
-      </w:r>
-      <w:r>
-        <w:rPr>
-          <w:rFonts w:ascii="Times New Roman" w:hAnsi="Times New Roman"/>
-          <w:sz w:val="24"/>
-          <w:szCs w:val="24"/>
-        </w:rPr>
-      </w:r>
-      <w:r>
-        <w:rPr>
-          <w:rFonts w:ascii="Times New Roman" w:hAnsi="Times New Roman"/>
-          <w:sz w:val="24"/>
-          <w:szCs w:val="24"/>
-          <w:lang w:val="it-IT"/>
-        </w:rPr>
-      </w:r>
-      <w:r>
-        <w:rPr>
-          <w:rFonts w:ascii="Times New Roman" w:hAnsi="Times New Roman"/>
-          <w:spacing w:val="-4"/>
-          <w:sz w:val="24"/>
-          <w:szCs w:val="24"/>
-          <w:lang w:val="de-DE"/>
-        </w:rPr>
-      </w:r>
-      <w:r>
-        <w:rPr>
-          <w:rFonts w:ascii="Times New Roman" w:hAnsi="Times New Roman"/>
-          <w:spacing w:val="-4"/>
-          <w:sz w:val="24"/>
-          <w:szCs w:val="24"/>
-          <w:lang w:val="vi-VN"/>
-        </w:rPr>
-      </w:r>
-      <w:r>
-        <w:rPr>
-          <w:rFonts w:ascii="Times New Roman" w:hAnsi="Times New Roman"/>
-          <w:spacing w:val="-4"/>
-          <w:sz w:val="24"/>
-          <w:szCs w:val="24"/>
-        </w:rPr>
-      </w:r>
-      <w:r>
-        <w:rPr>
-          <w:rFonts w:ascii="Times New Roman" w:hAnsi="Times New Roman"/>
-          <w:spacing w:val="-4"/>
-          <w:sz w:val="24"/>
-          <w:szCs w:val="24"/>
-          <w:lang w:val="de-DE"/>
-        </w:rPr>
-      </w:r>
     </w:p>
     <w:p>
       <w:pPr>
@@ -792,56 +602,17 @@
           <w:szCs w:val="24"/>
           <w:lang w:val="de-DE"/>
         </w:rPr>
-        <w:t>-  02 bộ hồ sơ Chứng thư Thẩm định giá số chứng thư : {{SO_HOP_DONG}} ngày ..../04/2026</w:t>
-      </w:r>
-      <w:r>
-        <w:rPr>
-          <w:rFonts w:ascii="Times New Roman" w:hAnsi="Times New Roman"/>
-          <w:sz w:val="24"/>
-          <w:szCs w:val="24"/>
+        <w:t xml:space="preserve">-  02 bộ hồ sơ Chứng thư Thẩm định giá số chứng thư : {{SO_HOP_DONG}} ngày </w:t>
+      </w:r>
+      <w:r>
+        <w:rPr>
+          <w:rFonts w:ascii="Times New Roman" w:hAnsi="Times New Roman"/>
+          <w:sz w:val="24"/>
+          <w:szCs w:val="24"/>
+          <w:highlight w:val="yellow"/>
           <w:lang w:val="de-DE"/>
         </w:rPr>
-      </w:r>
-      <w:r>
-        <w:rPr>
-          <w:rFonts w:ascii="Times New Roman" w:hAnsi="Times New Roman"/>
-          <w:bCs/>
-          <w:sz w:val="24"/>
-          <w:szCs w:val="24"/>
-          <w:lang w:val="nl-NL"/>
-        </w:rPr>
-      </w:r>
-      <w:r>
-        <w:rPr>
-          <w:rFonts w:ascii="Times New Roman" w:hAnsi="Times New Roman"/>
-          <w:noProof/>
-          <w:sz w:val="24"/>
-          <w:szCs w:val="24"/>
-        </w:rPr>
-      </w:r>
-      <w:r>
-        <w:rPr>
-          <w:rFonts w:ascii="Times New Roman" w:hAnsi="Times New Roman"/>
-          <w:bCs/>
-          <w:sz w:val="24"/>
-          <w:szCs w:val="24"/>
-        </w:rPr>
-      </w:r>
-      <w:r>
-        <w:rPr>
-          <w:rFonts w:ascii="Times New Roman" w:hAnsi="Times New Roman"/>
-          <w:bCs/>
-          <w:sz w:val="24"/>
-          <w:szCs w:val="24"/>
-        </w:rPr>
-      </w:r>
-      <w:r>
-        <w:rPr>
-          <w:rFonts w:ascii="Times New Roman" w:hAnsi="Times New Roman"/>
-          <w:bCs/>
-          <w:sz w:val="24"/>
-          <w:szCs w:val="24"/>
-        </w:rPr>
+        <w:t>..../04/2026</w:t>
       </w:r>
     </w:p>
     <w:p>
@@ -869,7 +640,7 @@
     </w:p>
     <w:p>
       <w:pPr>
-        <w:pStyle w:val="Thnvnban3"/>
+        <w:pStyle w:val="BodyText3"/>
         <w:shd w:val="clear" w:color="auto" w:fill="FFFFFF" w:themeFill="background1"/>
         <w:tabs>
           <w:tab w:val="left" w:pos="360"/>
@@ -1109,9 +880,9 @@
           <w:lang w:val="fr-FR"/>
         </w:rPr>
         <w:sectPr>
-          <w:footerReference w:type="default" r:id="rId8"/>
-          <w:footerReference w:type="first" r:id="rId9"/>
-          <w:headerReference w:type="default" r:id="rId14"/>
+          <w:headerReference w:type="default" r:id="rId8"/>
+          <w:footerReference w:type="default" r:id="rId9"/>
+          <w:footerReference w:type="first" r:id="rId10"/>
           <w:pgSz w:w="11905" w:h="16837" w:code="9"/>
           <w:pgMar w:top="720" w:right="850" w:bottom="288" w:left="1411" w:header="720" w:footer="562" w:gutter="0"/>
           <w:pgNumType w:start="1"/>
@@ -1134,8 +905,8 @@
       </w:pPr>
     </w:p>
     <w:sectPr>
-      <w:footerReference w:type="default" r:id="rId10"/>
-      <w:footerReference w:type="first" r:id="rId11"/>
+      <w:footerReference w:type="default" r:id="rId11"/>
+      <w:footerReference w:type="first" r:id="rId12"/>
       <w:type w:val="continuous"/>
       <w:pgSz w:w="11905" w:h="16837" w:code="9"/>
       <w:pgMar w:top="720" w:right="850" w:bottom="288" w:left="1411" w:header="720" w:footer="562" w:gutter="0"/>
@@ -1170,7 +941,7 @@
 <w:ftr xmlns:wpc="http://schemas.microsoft.com/office/word/2010/wordprocessingCanvas" xmlns:cx="http://schemas.microsoft.com/office/drawing/2014/chartex" xmlns:cx1="http://schemas.microsoft.com/office/drawing/2015/9/8/chartex" xmlns:cx2="http://schemas.microsoft.com/office/drawing/2015/10/21/chartex" xmlns:cx3="http://schemas.microsoft.com/office/drawing/2016/5/9/chartex" xmlns:cx4="http://schemas.microsoft.com/office/drawing/2016/5/10/chartex" xmlns:cx5="http://schemas.microsoft.com/office/drawing/2016/5/11/chartex" xmlns:cx6="http://schemas.microsoft.com/office/drawing/2016/5/12/chartex" xmlns:cx7="http://schemas.microsoft.com/office/drawing/2016/5/13/chartex" xmlns:cx8="http://schemas.microsoft.com/office/drawing/2016/5/14/chartex" xmlns:mc="http://schemas.openxmlformats.org/markup-compatibility/2006" xmlns:aink="http://schemas.microsoft.com/office/drawing/2016/ink" xmlns:am3d="http://schemas.microsoft.com/office/drawing/2017/model3d" xmlns:o="urn:schemas-microsoft-com:office:office" xmlns:oel="http://schemas.microsoft.com/office/2019/extlst" xmlns:r="http://schemas.openxmlformats.org/officeDocument/2006/relationships" xmlns:m="http://schemas.openxmlformats.org/officeDocument/2006/math" xmlns:v="urn:schemas-microsoft-com:vml" xmlns:wp14="http://schemas.microsoft.com/office/word/2010/wordprocessingDrawing" xmlns:wp="http://schemas.openxmlformats.org/drawingml/2006/wordprocessingDrawing" xmlns:w10="urn:schemas-microsoft-com:office:word" xmlns:w="http://schemas.openxmlformats.org/wordprocessingml/2006/main" xmlns:w14="http://schemas.microsoft.com/office/word/2010/wordml" xmlns:w15="http://schemas.microsoft.com/office/word/2012/wordml" xmlns:w16cex="http://schemas.microsoft.com/office/word/2018/wordml/cex" xmlns:w16cid="http://schemas.microsoft.com/office/word/2016/wordml/cid" xmlns:w16="http://schemas.microsoft.com/office/word/2018/wordml" xmlns:w16du="http://schemas.microsoft.com/office/word/2023/wordml/word16du" xmlns:w16sdtdh="http://schemas.microsoft.com/office/word/2020/wordml/sdtdatahash" xmlns:w16sdtfl="http://schemas.microsoft.com/office/word/2024/wordml/sdtformatlock" xmlns:w16se="http://schemas.microsoft.com/office/word/2015/wordml/symex" xmlns:wpg="http://schemas.microsoft.com/office/word/2010/wordprocessingGroup" xmlns:wpi="http://schemas.microsoft.com/office/word/2010/wordprocessingInk" xmlns:wne="http://schemas.microsoft.com/office/word/2006/wordml" xmlns:wps="http://schemas.microsoft.com/office/word/2010/wordprocessingShape" mc:Ignorable="w14 w15 w16se w16cid w16 w16cex w16sdtdh w16sdtfl w16du wp14">
   <w:p>
     <w:pPr>
-      <w:pStyle w:val="Chntrang"/>
+      <w:pStyle w:val="Footer"/>
       <w:rPr>
         <w:rFonts w:ascii="Times New Roman" w:hAnsi="Times New Roman"/>
       </w:rPr>
@@ -1178,7 +949,7 @@
   </w:p>
   <w:p>
     <w:pPr>
-      <w:pStyle w:val="Chntrang"/>
+      <w:pStyle w:val="Footer"/>
       <w:jc w:val="center"/>
       <w:rPr>
         <w:rFonts w:ascii="Times New Roman" w:hAnsi="Times New Roman"/>
@@ -1192,7 +963,7 @@
 <w:ftr xmlns:wpc="http://schemas.microsoft.com/office/word/2010/wordprocessingCanvas" xmlns:cx="http://schemas.microsoft.com/office/drawing/2014/chartex" xmlns:cx1="http://schemas.microsoft.com/office/drawing/2015/9/8/chartex" xmlns:cx2="http://schemas.microsoft.com/office/drawing/2015/10/21/chartex" xmlns:cx3="http://schemas.microsoft.com/office/drawing/2016/5/9/chartex" xmlns:cx4="http://schemas.microsoft.com/office/drawing/2016/5/10/chartex" xmlns:cx5="http://schemas.microsoft.com/office/drawing/2016/5/11/chartex" xmlns:cx6="http://schemas.microsoft.com/office/drawing/2016/5/12/chartex" xmlns:cx7="http://schemas.microsoft.com/office/drawing/2016/5/13/chartex" xmlns:cx8="http://schemas.microsoft.com/office/drawing/2016/5/14/chartex" xmlns:mc="http://schemas.openxmlformats.org/markup-compatibility/2006" xmlns:aink="http://schemas.microsoft.com/office/drawing/2016/ink" xmlns:am3d="http://schemas.microsoft.com/office/drawing/2017/model3d" xmlns:o="urn:schemas-microsoft-com:office:office" xmlns:oel="http://schemas.microsoft.com/office/2019/extlst" xmlns:r="http://schemas.openxmlformats.org/officeDocument/2006/relationships" xmlns:m="http://schemas.openxmlformats.org/officeDocument/2006/math" xmlns:v="urn:schemas-microsoft-com:vml" xmlns:wp14="http://schemas.microsoft.com/office/word/2010/wordprocessingDrawing" xmlns:wp="http://schemas.openxmlformats.org/drawingml/2006/wordprocessingDrawing" xmlns:w10="urn:schemas-microsoft-com:office:word" xmlns:w="http://schemas.openxmlformats.org/wordprocessingml/2006/main" xmlns:w14="http://schemas.microsoft.com/office/word/2010/wordml" xmlns:w15="http://schemas.microsoft.com/office/word/2012/wordml" xmlns:w16cex="http://schemas.microsoft.com/office/word/2018/wordml/cex" xmlns:w16cid="http://schemas.microsoft.com/office/word/2016/wordml/cid" xmlns:w16="http://schemas.microsoft.com/office/word/2018/wordml" xmlns:w16du="http://schemas.microsoft.com/office/word/2023/wordml/word16du" xmlns:w16sdtdh="http://schemas.microsoft.com/office/word/2020/wordml/sdtdatahash" xmlns:w16sdtfl="http://schemas.microsoft.com/office/word/2024/wordml/sdtformatlock" xmlns:w16se="http://schemas.microsoft.com/office/word/2015/wordml/symex" xmlns:wpg="http://schemas.microsoft.com/office/word/2010/wordprocessingGroup" xmlns:wpi="http://schemas.microsoft.com/office/word/2010/wordprocessingInk" xmlns:wne="http://schemas.microsoft.com/office/word/2006/wordml" xmlns:wps="http://schemas.microsoft.com/office/word/2010/wordprocessingShape" mc:Ignorable="w14 w15 w16se w16cid w16 w16cex w16sdtdh w16sdtfl w16du wp14">
   <w:p>
     <w:pPr>
-      <w:pStyle w:val="Chntrang"/>
+      <w:pStyle w:val="Footer"/>
       <w:jc w:val="center"/>
       <w:rPr>
         <w:rFonts w:ascii="Times New Roman" w:hAnsi="Times New Roman"/>
@@ -1201,7 +972,7 @@
   </w:p>
   <w:p>
     <w:pPr>
-      <w:pStyle w:val="Chntrang"/>
+      <w:pStyle w:val="Footer"/>
     </w:pPr>
   </w:p>
 </w:ftr>
@@ -1211,7 +982,7 @@
 <w:ftr xmlns:wpc="http://schemas.microsoft.com/office/word/2010/wordprocessingCanvas" xmlns:cx="http://schemas.microsoft.com/office/drawing/2014/chartex" xmlns:cx1="http://schemas.microsoft.com/office/drawing/2015/9/8/chartex" xmlns:cx2="http://schemas.microsoft.com/office/drawing/2015/10/21/chartex" xmlns:cx3="http://schemas.microsoft.com/office/drawing/2016/5/9/chartex" xmlns:cx4="http://schemas.microsoft.com/office/drawing/2016/5/10/chartex" xmlns:cx5="http://schemas.microsoft.com/office/drawing/2016/5/11/chartex" xmlns:cx6="http://schemas.microsoft.com/office/drawing/2016/5/12/chartex" xmlns:cx7="http://schemas.microsoft.com/office/drawing/2016/5/13/chartex" xmlns:cx8="http://schemas.microsoft.com/office/drawing/2016/5/14/chartex" xmlns:mc="http://schemas.openxmlformats.org/markup-compatibility/2006" xmlns:aink="http://schemas.microsoft.com/office/drawing/2016/ink" xmlns:am3d="http://schemas.microsoft.com/office/drawing/2017/model3d" xmlns:o="urn:schemas-microsoft-com:office:office" xmlns:oel="http://schemas.microsoft.com/office/2019/extlst" xmlns:r="http://schemas.openxmlformats.org/officeDocument/2006/relationships" xmlns:m="http://schemas.openxmlformats.org/officeDocument/2006/math" xmlns:v="urn:schemas-microsoft-com:vml" xmlns:wp14="http://schemas.microsoft.com/office/word/2010/wordprocessingDrawing" xmlns:wp="http://schemas.openxmlformats.org/drawingml/2006/wordprocessingDrawing" xmlns:w10="urn:schemas-microsoft-com:office:word" xmlns:w="http://schemas.openxmlformats.org/wordprocessingml/2006/main" xmlns:w14="http://schemas.microsoft.com/office/word/2010/wordml" xmlns:w15="http://schemas.microsoft.com/office/word/2012/wordml" xmlns:w16cex="http://schemas.microsoft.com/office/word/2018/wordml/cex" xmlns:w16cid="http://schemas.microsoft.com/office/word/2016/wordml/cid" xmlns:w16="http://schemas.microsoft.com/office/word/2018/wordml" xmlns:w16du="http://schemas.microsoft.com/office/word/2023/wordml/word16du" xmlns:w16sdtdh="http://schemas.microsoft.com/office/word/2020/wordml/sdtdatahash" xmlns:w16sdtfl="http://schemas.microsoft.com/office/word/2024/wordml/sdtformatlock" xmlns:w16se="http://schemas.microsoft.com/office/word/2015/wordml/symex" xmlns:wpg="http://schemas.microsoft.com/office/word/2010/wordprocessingGroup" xmlns:wpi="http://schemas.microsoft.com/office/word/2010/wordprocessingInk" xmlns:wne="http://schemas.microsoft.com/office/word/2006/wordml" xmlns:wps="http://schemas.microsoft.com/office/word/2010/wordprocessingShape" mc:Ignorable="w14 w15 w16se w16cid w16 w16cex w16sdtdh w16sdtfl w16du wp14">
   <w:p>
     <w:pPr>
-      <w:pStyle w:val="Chntrang"/>
+      <w:pStyle w:val="Footer"/>
       <w:rPr>
         <w:rFonts w:ascii="Times New Roman" w:hAnsi="Times New Roman"/>
       </w:rPr>
@@ -1219,7 +990,7 @@
   </w:p>
   <w:p>
     <w:pPr>
-      <w:pStyle w:val="Chntrang"/>
+      <w:pStyle w:val="Footer"/>
       <w:jc w:val="center"/>
       <w:rPr>
         <w:rFonts w:ascii="Times New Roman" w:hAnsi="Times New Roman"/>
@@ -1233,7 +1004,7 @@
 <w:ftr xmlns:wpc="http://schemas.microsoft.com/office/word/2010/wordprocessingCanvas" xmlns:cx="http://schemas.microsoft.com/office/drawing/2014/chartex" xmlns:cx1="http://schemas.microsoft.com/office/drawing/2015/9/8/chartex" xmlns:cx2="http://schemas.microsoft.com/office/drawing/2015/10/21/chartex" xmlns:cx3="http://schemas.microsoft.com/office/drawing/2016/5/9/chartex" xmlns:cx4="http://schemas.microsoft.com/office/drawing/2016/5/10/chartex" xmlns:cx5="http://schemas.microsoft.com/office/drawing/2016/5/11/chartex" xmlns:cx6="http://schemas.microsoft.com/office/drawing/2016/5/12/chartex" xmlns:cx7="http://schemas.microsoft.com/office/drawing/2016/5/13/chartex" xmlns:cx8="http://schemas.microsoft.com/office/drawing/2016/5/14/chartex" xmlns:mc="http://schemas.openxmlformats.org/markup-compatibility/2006" xmlns:aink="http://schemas.microsoft.com/office/drawing/2016/ink" xmlns:am3d="http://schemas.microsoft.com/office/drawing/2017/model3d" xmlns:o="urn:schemas-microsoft-com:office:office" xmlns:oel="http://schemas.microsoft.com/office/2019/extlst" xmlns:r="http://schemas.openxmlformats.org/officeDocument/2006/relationships" xmlns:m="http://schemas.openxmlformats.org/officeDocument/2006/math" xmlns:v="urn:schemas-microsoft-com:vml" xmlns:wp14="http://schemas.microsoft.com/office/word/2010/wordprocessingDrawing" xmlns:wp="http://schemas.openxmlformats.org/drawingml/2006/wordprocessingDrawing" xmlns:w10="urn:schemas-microsoft-com:office:word" xmlns:w="http://schemas.openxmlformats.org/wordprocessingml/2006/main" xmlns:w14="http://schemas.microsoft.com/office/word/2010/wordml" xmlns:w15="http://schemas.microsoft.com/office/word/2012/wordml" xmlns:w16cex="http://schemas.microsoft.com/office/word/2018/wordml/cex" xmlns:w16cid="http://schemas.microsoft.com/office/word/2016/wordml/cid" xmlns:w16="http://schemas.microsoft.com/office/word/2018/wordml" xmlns:w16du="http://schemas.microsoft.com/office/word/2023/wordml/word16du" xmlns:w16sdtdh="http://schemas.microsoft.com/office/word/2020/wordml/sdtdatahash" xmlns:w16sdtfl="http://schemas.microsoft.com/office/word/2024/wordml/sdtformatlock" xmlns:w16se="http://schemas.microsoft.com/office/word/2015/wordml/symex" xmlns:wpg="http://schemas.microsoft.com/office/word/2010/wordprocessingGroup" xmlns:wpi="http://schemas.microsoft.com/office/word/2010/wordprocessingInk" xmlns:wne="http://schemas.microsoft.com/office/word/2006/wordml" xmlns:wps="http://schemas.microsoft.com/office/word/2010/wordprocessingShape" mc:Ignorable="w14 w15 w16se w16cid w16 w16cex w16sdtdh w16sdtfl w16du wp14">
   <w:p>
     <w:pPr>
-      <w:pStyle w:val="Chntrang"/>
+      <w:pStyle w:val="Footer"/>
       <w:jc w:val="center"/>
       <w:rPr>
         <w:rFonts w:ascii="Times New Roman" w:hAnsi="Times New Roman"/>
@@ -1242,7 +1013,7 @@
   </w:p>
   <w:p>
     <w:pPr>
-      <w:pStyle w:val="Chntrang"/>
+      <w:pStyle w:val="Footer"/>
     </w:pPr>
   </w:p>
 </w:ftr>
@@ -1268,12 +1039,8 @@
 </file>
 
 <file path=word/header1.xml><?xml version="1.0" encoding="utf-8"?>
-<w:hdr xmlns:m="http://schemas.openxmlformats.org/officeDocument/2006/math" xmlns:mc="http://schemas.openxmlformats.org/markup-compatibility/2006" xmlns:mo="http://schemas.microsoft.com/office/mac/office/2008/main" xmlns:mv="urn:schemas-microsoft-com:mac:vml" xmlns:o="urn:schemas-microsoft-com:office:office" xmlns:r="http://schemas.openxmlformats.org/officeDocument/2006/relationships" xmlns:v="urn:schemas-microsoft-com:vml" xmlns:w10="urn:schemas-microsoft-com:office:word" xmlns:w14="http://schemas.microsoft.com/office/word/2010/wordml" xmlns:w="http://schemas.openxmlformats.org/wordprocessingml/2006/main" xmlns:wne="http://schemas.microsoft.com/office/word/2006/wordml" xmlns:wp14="http://schemas.microsoft.com/office/word/2010/wordprocessingDrawing" xmlns:wp="http://schemas.openxmlformats.org/drawingml/2006/wordprocessingDrawing" xmlns:wpc="http://schemas.microsoft.com/office/word/2010/wordprocessingCanvas" xmlns:wpg="http://schemas.microsoft.com/office/word/2010/wordprocessingGroup" xmlns:wpi="http://schemas.microsoft.com/office/word/2010/wordprocessingInk" xmlns:wps="http://schemas.microsoft.com/office/word/2010/wordprocessingShape" mc:Ignorable="w14 wp14">
-  <w:p>
-    <w:pPr>
-      <w:pStyle w:val="Header"/>
-    </w:pPr>
-  </w:p>
+<w:hdr xmlns:wpc="http://schemas.microsoft.com/office/word/2010/wordprocessingCanvas" xmlns:cx="http://schemas.microsoft.com/office/drawing/2014/chartex" xmlns:cx1="http://schemas.microsoft.com/office/drawing/2015/9/8/chartex" xmlns:cx2="http://schemas.microsoft.com/office/drawing/2015/10/21/chartex" xmlns:cx3="http://schemas.microsoft.com/office/drawing/2016/5/9/chartex" xmlns:cx4="http://schemas.microsoft.com/office/drawing/2016/5/10/chartex" xmlns:cx5="http://schemas.microsoft.com/office/drawing/2016/5/11/chartex" xmlns:cx6="http://schemas.microsoft.com/office/drawing/2016/5/12/chartex" xmlns:cx7="http://schemas.microsoft.com/office/drawing/2016/5/13/chartex" xmlns:cx8="http://schemas.microsoft.com/office/drawing/2016/5/14/chartex" xmlns:mc="http://schemas.openxmlformats.org/markup-compatibility/2006" xmlns:aink="http://schemas.microsoft.com/office/drawing/2016/ink" xmlns:am3d="http://schemas.microsoft.com/office/drawing/2017/model3d" xmlns:o="urn:schemas-microsoft-com:office:office" xmlns:oel="http://schemas.microsoft.com/office/2019/extlst" xmlns:r="http://schemas.openxmlformats.org/officeDocument/2006/relationships" xmlns:m="http://schemas.openxmlformats.org/officeDocument/2006/math" xmlns:v="urn:schemas-microsoft-com:vml" xmlns:wp14="http://schemas.microsoft.com/office/word/2010/wordprocessingDrawing" xmlns:wp="http://schemas.openxmlformats.org/drawingml/2006/wordprocessingDrawing" xmlns:w10="urn:schemas-microsoft-com:office:word" xmlns:w="http://schemas.openxmlformats.org/wordprocessingml/2006/main" xmlns:w14="http://schemas.microsoft.com/office/word/2010/wordml" xmlns:w15="http://schemas.microsoft.com/office/word/2012/wordml" xmlns:w16cex="http://schemas.microsoft.com/office/word/2018/wordml/cex" xmlns:w16cid="http://schemas.microsoft.com/office/word/2016/wordml/cid" xmlns:w16="http://schemas.microsoft.com/office/word/2018/wordml" xmlns:w16du="http://schemas.microsoft.com/office/word/2023/wordml/word16du" xmlns:w16sdtdh="http://schemas.microsoft.com/office/word/2020/wordml/sdtdatahash" xmlns:w16sdtfl="http://schemas.microsoft.com/office/word/2024/wordml/sdtformatlock" xmlns:w16se="http://schemas.microsoft.com/office/word/2015/wordml/symex" xmlns:wpg="http://schemas.microsoft.com/office/word/2010/wordprocessingGroup" xmlns:wpi="http://schemas.microsoft.com/office/word/2010/wordprocessingInk" xmlns:wne="http://schemas.microsoft.com/office/word/2006/wordml" xmlns:wps="http://schemas.microsoft.com/office/word/2010/wordprocessingShape" mc:Ignorable="w14 w15 w16se w16cid w16 w16cex w16sdtdh w16sdtfl w16du wp14">
+  <w:p/>
 </w:hdr>
 </file>
 
@@ -1919,7 +1686,7 @@
     <w:lsdException w:name="Unresolved Mention" w:semiHidden="1" w:uiPriority="99" w:unhideWhenUsed="1"/>
     <w:lsdException w:name="Smart Link" w:semiHidden="1" w:uiPriority="99" w:unhideWhenUsed="1"/>
   </w:latentStyles>
-  <w:style w:type="paragraph" w:default="1" w:styleId="Binhthng">
+  <w:style w:type="paragraph" w:default="1" w:styleId="Normal">
     <w:name w:val="Normal"/>
     <w:qFormat/>
     <w:rsid w:val="00A83A18"/>
@@ -1933,11 +1700,11 @@
       <w:lang w:eastAsia="ar-SA"/>
     </w:rPr>
   </w:style>
-  <w:style w:type="paragraph" w:styleId="u1">
+  <w:style w:type="paragraph" w:styleId="Heading1">
     <w:name w:val="heading 1"/>
-    <w:basedOn w:val="Binhthng"/>
-    <w:next w:val="Binhthng"/>
-    <w:link w:val="u1Char"/>
+    <w:basedOn w:val="Normal"/>
+    <w:next w:val="Normal"/>
+    <w:link w:val="Heading1Char"/>
     <w:qFormat/>
     <w:rsid w:val="00D665FA"/>
     <w:pPr>
@@ -1953,13 +1720,13 @@
       <w:szCs w:val="20"/>
     </w:rPr>
   </w:style>
-  <w:style w:type="character" w:default="1" w:styleId="Phngmcinhcuaoanvn">
+  <w:style w:type="character" w:default="1" w:styleId="DefaultParagraphFont">
     <w:name w:val="Default Paragraph Font"/>
     <w:uiPriority w:val="1"/>
     <w:semiHidden/>
     <w:unhideWhenUsed/>
   </w:style>
-  <w:style w:type="table" w:default="1" w:styleId="BangThngthng">
+  <w:style w:type="table" w:default="1" w:styleId="TableNormal">
     <w:name w:val="Normal Table"/>
     <w:uiPriority w:val="99"/>
     <w:semiHidden/>
@@ -1974,7 +1741,7 @@
       </w:tblCellMar>
     </w:tblPr>
   </w:style>
-  <w:style w:type="numbering" w:default="1" w:styleId="Khngco">
+  <w:style w:type="numbering" w:default="1" w:styleId="NoList">
     <w:name w:val="No List"/>
     <w:uiPriority w:val="99"/>
     <w:semiHidden/>
@@ -1982,7 +1749,7 @@
   </w:style>
   <w:style w:type="paragraph" w:customStyle="1" w:styleId="CharCharCharChar">
     <w:name w:val="Char Char Char Char"/>
-    <w:basedOn w:val="Binhthng"/>
+    <w:basedOn w:val="Normal"/>
     <w:autoRedefine/>
     <w:rsid w:val="005F297A"/>
     <w:pPr>
@@ -1996,10 +1763,10 @@
       <w:lang w:eastAsia="en-US"/>
     </w:rPr>
   </w:style>
-  <w:style w:type="character" w:customStyle="1" w:styleId="u1Char">
-    <w:name w:val="Đầu đề 1 Char"/>
-    <w:basedOn w:val="Phngmcinhcuaoanvn"/>
-    <w:link w:val="u1"/>
+  <w:style w:type="character" w:customStyle="1" w:styleId="Heading1Char">
+    <w:name w:val="Heading 1 Char"/>
+    <w:basedOn w:val="DefaultParagraphFont"/>
+    <w:link w:val="Heading1"/>
     <w:rsid w:val="00D665FA"/>
     <w:rPr>
       <w:rFonts w:ascii=".VnTimeH" w:hAnsi=".VnTimeH"/>
@@ -2008,10 +1775,10 @@
       <w:sz w:val="28"/>
     </w:rPr>
   </w:style>
-  <w:style w:type="paragraph" w:styleId="utrang">
+  <w:style w:type="paragraph" w:styleId="Header">
     <w:name w:val="header"/>
-    <w:basedOn w:val="Binhthng"/>
-    <w:link w:val="utrangChar"/>
+    <w:basedOn w:val="Normal"/>
+    <w:link w:val="HeaderChar"/>
     <w:rsid w:val="00373B0F"/>
     <w:pPr>
       <w:tabs>
@@ -2020,10 +1787,10 @@
       </w:tabs>
     </w:pPr>
   </w:style>
-  <w:style w:type="character" w:customStyle="1" w:styleId="utrangChar">
-    <w:name w:val="Đầu trang Char"/>
-    <w:basedOn w:val="Phngmcinhcuaoanvn"/>
-    <w:link w:val="utrang"/>
+  <w:style w:type="character" w:customStyle="1" w:styleId="HeaderChar">
+    <w:name w:val="Header Char"/>
+    <w:basedOn w:val="DefaultParagraphFont"/>
+    <w:link w:val="Header"/>
     <w:rsid w:val="00373B0F"/>
     <w:rPr>
       <w:rFonts w:ascii="VNI-Times" w:hAnsi="VNI-Times"/>
@@ -2032,10 +1799,10 @@
       <w:lang w:eastAsia="ar-SA"/>
     </w:rPr>
   </w:style>
-  <w:style w:type="paragraph" w:styleId="Chntrang">
+  <w:style w:type="paragraph" w:styleId="Footer">
     <w:name w:val="footer"/>
-    <w:basedOn w:val="Binhthng"/>
-    <w:link w:val="ChntrangChar"/>
+    <w:basedOn w:val="Normal"/>
+    <w:link w:val="FooterChar"/>
     <w:uiPriority w:val="99"/>
     <w:rsid w:val="00373B0F"/>
     <w:pPr>
@@ -2045,10 +1812,10 @@
       </w:tabs>
     </w:pPr>
   </w:style>
-  <w:style w:type="character" w:customStyle="1" w:styleId="ChntrangChar">
-    <w:name w:val="Chân trang Char"/>
-    <w:basedOn w:val="Phngmcinhcuaoanvn"/>
-    <w:link w:val="Chntrang"/>
+  <w:style w:type="character" w:customStyle="1" w:styleId="FooterChar">
+    <w:name w:val="Footer Char"/>
+    <w:basedOn w:val="DefaultParagraphFont"/>
+    <w:link w:val="Footer"/>
     <w:uiPriority w:val="99"/>
     <w:rsid w:val="00373B0F"/>
     <w:rPr>
@@ -2058,10 +1825,10 @@
       <w:lang w:eastAsia="ar-SA"/>
     </w:rPr>
   </w:style>
-  <w:style w:type="paragraph" w:styleId="Bongchuthich">
+  <w:style w:type="paragraph" w:styleId="BalloonText">
     <w:name w:val="Balloon Text"/>
-    <w:basedOn w:val="Binhthng"/>
-    <w:link w:val="BongchuthichChar"/>
+    <w:basedOn w:val="Normal"/>
+    <w:link w:val="BalloonTextChar"/>
     <w:rsid w:val="00373B0F"/>
     <w:rPr>
       <w:rFonts w:ascii="Tahoma" w:hAnsi="Tahoma" w:cs="Tahoma"/>
@@ -2069,10 +1836,10 @@
       <w:szCs w:val="16"/>
     </w:rPr>
   </w:style>
-  <w:style w:type="character" w:customStyle="1" w:styleId="BongchuthichChar">
-    <w:name w:val="Bóng chú thích Char"/>
-    <w:basedOn w:val="Phngmcinhcuaoanvn"/>
-    <w:link w:val="Bongchuthich"/>
+  <w:style w:type="character" w:customStyle="1" w:styleId="BalloonTextChar">
+    <w:name w:val="Balloon Text Char"/>
+    <w:basedOn w:val="DefaultParagraphFont"/>
+    <w:link w:val="BalloonText"/>
     <w:rsid w:val="00373B0F"/>
     <w:rPr>
       <w:rFonts w:ascii="Tahoma" w:hAnsi="Tahoma" w:cs="Tahoma"/>
@@ -2081,11 +1848,11 @@
       <w:lang w:eastAsia="ar-SA"/>
     </w:rPr>
   </w:style>
-  <w:style w:type="paragraph" w:styleId="oancuaDanhsach">
+  <w:style w:type="paragraph" w:styleId="ListParagraph">
     <w:name w:val="List Paragraph"/>
     <w:aliases w:val="VNA - List Paragraph,lp1,List Paragraph1,lp11,List Paragraph 1,My checklist,bullet 1,Bullet L1,Colorful List - Accent 11,List Paragraph11,bullet,Bullet List,FooterText,Paragraphe de liste,List Paragraph2"/>
-    <w:basedOn w:val="Binhthng"/>
-    <w:link w:val="oancuaDanhsachChar"/>
+    <w:basedOn w:val="Normal"/>
+    <w:link w:val="ListParagraphChar"/>
     <w:uiPriority w:val="34"/>
     <w:qFormat/>
     <w:rsid w:val="001F718B"/>
@@ -2101,10 +1868,10 @@
       <w:lang w:eastAsia="en-US"/>
     </w:rPr>
   </w:style>
-  <w:style w:type="character" w:customStyle="1" w:styleId="oancuaDanhsachChar">
-    <w:name w:val="Đoạn của Danh sách Char"/>
-    <w:aliases w:val="VNA - List Paragraph Char,lp1 Char,List Paragraph1 Char,lp11 Char,List Paragraph 1 Char,My checklist Char,bullet 1 Char,Bullet L1 Char,Colorful List - Accent 11 Char,List Paragraph11 Char,bullet Char,Bullet List Char"/>
-    <w:link w:val="oancuaDanhsach"/>
+  <w:style w:type="character" w:customStyle="1" w:styleId="ListParagraphChar">
+    <w:name w:val="List Paragraph Char"/>
+    <w:aliases w:val="VNA - List Paragraph Char,lp1 Char,List Paragraph1 Char,lp11 Char,List Paragraph 1 Char,My checklist Char,bullet 1 Char,Bullet L1 Char,Colorful List - Accent 11 Char,List Paragraph11 Char,bullet Char,Bullet List Char,FooterText Char"/>
+    <w:link w:val="ListParagraph"/>
     <w:locked/>
     <w:rsid w:val="001F718B"/>
     <w:rPr>
@@ -2116,7 +1883,7 @@
     <w:name w:val="apple-converted-space"/>
     <w:rsid w:val="006421E2"/>
   </w:style>
-  <w:style w:type="character" w:styleId="Nhnmanh">
+  <w:style w:type="character" w:styleId="Emphasis">
     <w:name w:val="Emphasis"/>
     <w:qFormat/>
     <w:rsid w:val="004000E7"/>
@@ -2125,10 +1892,10 @@
       <w:iCs/>
     </w:rPr>
   </w:style>
-  <w:style w:type="paragraph" w:styleId="Thnvnban3">
+  <w:style w:type="paragraph" w:styleId="BodyText3">
     <w:name w:val="Body Text 3"/>
-    <w:basedOn w:val="Binhthng"/>
-    <w:link w:val="Thnvnban3Char"/>
+    <w:basedOn w:val="Normal"/>
+    <w:link w:val="BodyText3Char"/>
     <w:rsid w:val="00FD2BEC"/>
     <w:pPr>
       <w:suppressAutoHyphens w:val="0"/>
@@ -2141,10 +1908,10 @@
       <w:lang w:eastAsia="en-US"/>
     </w:rPr>
   </w:style>
-  <w:style w:type="character" w:customStyle="1" w:styleId="Thnvnban3Char">
-    <w:name w:val="Thân văn bản 3 Char"/>
-    <w:basedOn w:val="Phngmcinhcuaoanvn"/>
-    <w:link w:val="Thnvnban3"/>
+  <w:style w:type="character" w:customStyle="1" w:styleId="BodyText3Char">
+    <w:name w:val="Body Text 3 Char"/>
+    <w:basedOn w:val="DefaultParagraphFont"/>
+    <w:link w:val="BodyText3"/>
     <w:rsid w:val="00FD2BEC"/>
     <w:rPr>
       <w:sz w:val="16"/>

</xml_diff>